<commit_message>
Lab 5: make stock deduction in QE210005_ProcAddItem atomic
The stock check ran before the transaction, so two concurrent calls could
both see enough stock. Deduction is now a single
UPDATE ... WHERE SLTon >= @SL inside the transaction; @@ROWCOUNT = 0
rolls back and returns -3 with an "insufficient stock" error.

Co-Authored-By: Claude Sonnet 5.5 <noreply@anthropic.com>
Claude-Session: https://claude.ai/code/session_01SargMTe12nKtrCRsFCRuGG
</commit_message>
<xml_diff>
--- a/output/Lab5.docx
+++ b/output/Lab5.docx
@@ -1001,7 +1001,7 @@
               <w:br/>
               <w:t xml:space="preserve">    SET NOCOUNT ON;</w:t>
               <w:br/>
-              <w:t xml:space="preserve">    DECLARE @CurrentStock int, @DefaultPrice int;</w:t>
+              <w:t xml:space="preserve">    DECLARE @CurrentStock int, @DefaultPrice int, @Rows int = 0;</w:t>
               <w:br/>
               <w:br/>
               <w:t xml:space="preserve">    -- 1. Validate input BEFORE the transaction (outside TRY, so RETURN codes are reachable)</w:t>
@@ -1044,52 +1044,52 @@
               <w:t xml:space="preserve">    END;</w:t>
               <w:br/>
               <w:br/>
-              <w:t xml:space="preserve">    IF @CurrentStock &lt; @SL</w:t>
-              <w:br/>
-              <w:t xml:space="preserve">    BEGIN</w:t>
-              <w:br/>
-              <w:t xml:space="preserve">        RAISERROR(N'Error: Insufficient stock for material %s! Available: %d, Requested: %d', 16, 1, @MaVT, @CurrentStock, @SL);</w:t>
-              <w:br/>
-              <w:t xml:space="preserve">        RETURN -3;</w:t>
-              <w:br/>
-              <w:t xml:space="preserve">    END;</w:t>
-              <w:br/>
-              <w:br/>
               <w:t xml:space="preserve">    IF @GiaBan IS NULL</w:t>
               <w:br/>
               <w:t xml:space="preserve">        SET @GiaBan = CAST(@DefaultPrice * 1.15 AS INT); -- Default 15% markup</w:t>
               <w:br/>
               <w:br/>
-              <w:t xml:space="preserve">    -- 2. Insert/update the line item and deduct stock as ONE atomic transaction</w:t>
+              <w:t xml:space="preserve">    -- 2. Deduct stock ATOMICALLY (the stock test is part of the UPDATE), then add the line item</w:t>
               <w:br/>
               <w:t xml:space="preserve">    BEGIN TRY</w:t>
               <w:br/>
               <w:t xml:space="preserve">        BEGIN TRANSACTION;</w:t>
               <w:br/>
               <w:br/>
-              <w:t xml:space="preserve">        IF EXISTS (SELECT 1 FROM CHITIETHOADON WHERE MaHD = @MaHD AND MaVT = @MaVT)</w:t>
-              <w:br/>
-              <w:t xml:space="preserve">            UPDATE CHITIETHOADON</w:t>
-              <w:br/>
-              <w:t xml:space="preserve">            SET SL = SL + @SL, GiaBan = @GiaBan, KhuyenMai = @KhuyenMai</w:t>
-              <w:br/>
-              <w:t xml:space="preserve">            WHERE MaHD = @MaHD AND MaVT = @MaVT;</w:t>
-              <w:br/>
-              <w:t xml:space="preserve">        ELSE</w:t>
-              <w:br/>
-              <w:t xml:space="preserve">            INSERT INTO CHITIETHOADON(MaHD, MaVT, SL, KhuyenMai, GiaBan)</w:t>
-              <w:br/>
-              <w:t xml:space="preserve">            VALUES (@MaHD, @MaVT, @SL, @KhuyenMai, @GiaBan);</w:t>
-              <w:br/>
-              <w:br/>
               <w:t xml:space="preserve">        UPDATE VATTU</w:t>
               <w:br/>
               <w:t xml:space="preserve">        SET SLTon = SLTon - @SL</w:t>
               <w:br/>
-              <w:t xml:space="preserve">        WHERE MaVT = @MaVT;</w:t>
+              <w:t xml:space="preserve">        WHERE MaVT = @MaVT AND SLTon &gt;= @SL;</w:t>
+              <w:br/>
+              <w:t xml:space="preserve">        SET @Rows = @@ROWCOUNT;</w:t>
               <w:br/>
               <w:br/>
-              <w:t xml:space="preserve">        COMMIT TRANSACTION;</w:t>
+              <w:t xml:space="preserve">        IF @Rows = 1</w:t>
+              <w:br/>
+              <w:t xml:space="preserve">        BEGIN</w:t>
+              <w:br/>
+              <w:t xml:space="preserve">            IF EXISTS (SELECT 1 FROM CHITIETHOADON WHERE MaHD = @MaHD AND MaVT = @MaVT)</w:t>
+              <w:br/>
+              <w:t xml:space="preserve">                UPDATE CHITIETHOADON</w:t>
+              <w:br/>
+              <w:t xml:space="preserve">                SET SL = SL + @SL, GiaBan = @GiaBan, KhuyenMai = @KhuyenMai</w:t>
+              <w:br/>
+              <w:t xml:space="preserve">                WHERE MaHD = @MaHD AND MaVT = @MaVT;</w:t>
+              <w:br/>
+              <w:t xml:space="preserve">            ELSE</w:t>
+              <w:br/>
+              <w:t xml:space="preserve">                INSERT INTO CHITIETHOADON(MaHD, MaVT, SL, KhuyenMai, GiaBan)</w:t>
+              <w:br/>
+              <w:t xml:space="preserve">                VALUES (@MaHD, @MaVT, @SL, @KhuyenMai, @GiaBan);</w:t>
+              <w:br/>
+              <w:t xml:space="preserve">            COMMIT TRANSACTION;</w:t>
+              <w:br/>
+              <w:t xml:space="preserve">        END</w:t>
+              <w:br/>
+              <w:t xml:space="preserve">        ELSE</w:t>
+              <w:br/>
+              <w:t xml:space="preserve">            ROLLBACK TRANSACTION; -- not enough stock: nothing was changed</w:t>
               <w:br/>
               <w:t xml:space="preserve">    END TRY</w:t>
               <w:br/>
@@ -1100,6 +1100,19 @@
               <w:t xml:space="preserve">        THROW; -- re-raise the original error</w:t>
               <w:br/>
               <w:t xml:space="preserve">    END CATCH;</w:t>
+              <w:br/>
+              <w:br/>
+              <w:t xml:space="preserve">    IF @Rows = 0</w:t>
+              <w:br/>
+              <w:t xml:space="preserve">    BEGIN</w:t>
+              <w:br/>
+              <w:t xml:space="preserve">        SELECT @CurrentStock = SLTon FROM VATTU WHERE MaVT = @MaVT;</w:t>
+              <w:br/>
+              <w:t xml:space="preserve">        RAISERROR(N'Error: Insufficient stock for material %s! Available: %d, Requested: %d', 16, 1, @MaVT, @CurrentStock, @SL);</w:t>
+              <w:br/>
+              <w:t xml:space="preserve">        RETURN -3;</w:t>
+              <w:br/>
+              <w:t xml:space="preserve">    END;</w:t>
               <w:br/>
               <w:br/>
               <w:t xml:space="preserve">    PRINT N'Success: Added material ' + @MaVT + N' to invoice ' + @MaHD;</w:t>

</xml_diff>